<commit_message>
docs: add CiberEscudo_Semana5 documentation file
</commit_message>
<xml_diff>
--- a/DOCUMENTATION/TRABAJO_GRUPAL/CiberEscudo_Semana5.docx
+++ b/DOCUMENTATION/TRABAJO_GRUPAL/CiberEscudo_Semana5.docx
@@ -7075,6 +7075,587 @@
     <w:p>
       <w:r>
         <w:br w:type="page"/>
+      </w:r>
+    </w:p>
+    <w:p>
+      <w:r>
+        <w:br w:type="page"/>
+      </w:r>
+    </w:p>
+    <w:p>
+      <w:pPr>
+        <w:pStyle w:val="Ttulo1"/>
+      </w:pPr>
+      <w:r>
+        <w:t>5. Guía de instalación y ejecución local</w:t>
+      </w:r>
+    </w:p>
+    <w:p>
+      <w:pPr/>
+      <w:r>
+        <w:t>Esta sección describe los pasos necesarios para clonar el repositorio, configurar el entorno virtual, instalar las dependencias e iniciar la aplicación CiberEscudo en un equipo local.</w:t>
+      </w:r>
+    </w:p>
+    <w:p>
+      <w:pPr>
+        <w:pStyle w:val="Ttulo2"/>
+      </w:pPr>
+      <w:r>
+        <w:t>5.1 Requisitos previos</w:t>
+      </w:r>
+    </w:p>
+    <w:p>
+      <w:pPr/>
+      <w:r>
+        <w:t>Python 3.10 o superior — https://www.python.org/downloads/</w:t>
+      </w:r>
+    </w:p>
+    <w:p>
+      <w:pPr/>
+      <w:r>
+        <w:t>Git — https://git-scm.com/</w:t>
+      </w:r>
+    </w:p>
+    <w:p>
+      <w:pPr/>
+      <w:r>
+        <w:t>Terminal (PowerShell, CMD o bash en macOS/Linux)</w:t>
+      </w:r>
+    </w:p>
+    <w:p>
+      <w:pPr>
+        <w:pStyle w:val="Ttulo2"/>
+      </w:pPr>
+      <w:r>
+        <w:t>5.2 Clonar el repositorio</w:t>
+      </w:r>
+    </w:p>
+    <w:p>
+      <w:pPr/>
+      <w:r>
+        <w:t>Ejecuta los siguientes comandos en tu terminal:</w:t>
+      </w:r>
+    </w:p>
+    <w:p>
+      <w:pPr>
+        <w:shd w:val="clear" w:color="auto" w:fill="F0F0F0"/>
+      </w:pPr>
+      <w:r>
+        <w:rPr>
+          <w:rFonts w:ascii="Courier New" w:hAnsi="Courier New"/>
+          <w:sz w:val="18"/>
+        </w:rPr>
+        <w:t>git clone https://github.com/cr1c4rd0/POLI_ARQUITECTURA_DE_SOFTWARE.git</w:t>
+      </w:r>
+    </w:p>
+    <w:p>
+      <w:pPr>
+        <w:shd w:val="clear" w:color="auto" w:fill="F0F0F0"/>
+      </w:pPr>
+      <w:r>
+        <w:rPr>
+          <w:rFonts w:ascii="Courier New" w:hAnsi="Courier New"/>
+          <w:sz w:val="18"/>
+        </w:rPr>
+        <w:t>cd POLI_ARQUITECTURA_DE_SOFTWARE</w:t>
+      </w:r>
+    </w:p>
+    <w:p>
+      <w:pPr>
+        <w:pStyle w:val="Ttulo2"/>
+      </w:pPr>
+      <w:r>
+        <w:t>5.3 Crear el entorno virtual</w:t>
+      </w:r>
+    </w:p>
+    <w:p>
+      <w:pPr/>
+      <w:r>
+        <w:t>Se recomienda usar un entorno virtual para aislar las dependencias del proyecto y evitar conflictos con otras instalaciones de Python en el equipo.</w:t>
+      </w:r>
+    </w:p>
+    <w:p>
+      <w:pPr/>
+      <w:r>
+        <w:rPr>
+          <w:b/>
+        </w:rPr>
+        <w:t>En Windows:</w:t>
+      </w:r>
+    </w:p>
+    <w:p>
+      <w:pPr>
+        <w:shd w:val="clear" w:color="auto" w:fill="F0F0F0"/>
+      </w:pPr>
+      <w:r>
+        <w:rPr>
+          <w:rFonts w:ascii="Courier New" w:hAnsi="Courier New"/>
+          <w:sz w:val="18"/>
+        </w:rPr>
+        <w:t>python -m venv .venv</w:t>
+      </w:r>
+    </w:p>
+    <w:p>
+      <w:pPr>
+        <w:shd w:val="clear" w:color="auto" w:fill="F0F0F0"/>
+      </w:pPr>
+      <w:r>
+        <w:rPr>
+          <w:rFonts w:ascii="Courier New" w:hAnsi="Courier New"/>
+          <w:sz w:val="18"/>
+        </w:rPr>
+        <w:t>.venv\Scripts\activate</w:t>
+      </w:r>
+    </w:p>
+    <w:p>
+      <w:pPr/>
+      <w:r>
+        <w:rPr>
+          <w:b/>
+        </w:rPr>
+        <w:t>En macOS / Linux:</w:t>
+      </w:r>
+    </w:p>
+    <w:p>
+      <w:pPr>
+        <w:shd w:val="clear" w:color="auto" w:fill="F0F0F0"/>
+      </w:pPr>
+      <w:r>
+        <w:rPr>
+          <w:rFonts w:ascii="Courier New" w:hAnsi="Courier New"/>
+          <w:sz w:val="18"/>
+        </w:rPr>
+        <w:t>python3 -m venv .venv</w:t>
+      </w:r>
+    </w:p>
+    <w:p>
+      <w:pPr>
+        <w:shd w:val="clear" w:color="auto" w:fill="F0F0F0"/>
+      </w:pPr>
+      <w:r>
+        <w:rPr>
+          <w:rFonts w:ascii="Courier New" w:hAnsi="Courier New"/>
+          <w:sz w:val="18"/>
+        </w:rPr>
+        <w:t>source .venv/bin/activate</w:t>
+      </w:r>
+    </w:p>
+    <w:p>
+      <w:pPr/>
+      <w:r>
+        <w:t>Cuando el entorno este activo, el prompt de la terminal mostrara el prefijo (.venv) al inicio de la linea.</w:t>
+      </w:r>
+    </w:p>
+    <w:p>
+      <w:pPr>
+        <w:pStyle w:val="Ttulo2"/>
+      </w:pPr>
+      <w:r>
+        <w:t>5.4 Instalar Flask y dependencias</w:t>
+      </w:r>
+    </w:p>
+    <w:p>
+      <w:pPr/>
+      <w:r>
+        <w:t>Con el entorno virtual activo, instala todos los paquetes necesarios:</w:t>
+      </w:r>
+    </w:p>
+    <w:p>
+      <w:pPr>
+        <w:shd w:val="clear" w:color="auto" w:fill="F0F0F0"/>
+      </w:pPr>
+      <w:r>
+        <w:rPr>
+          <w:rFonts w:ascii="Courier New" w:hAnsi="Courier New"/>
+          <w:sz w:val="18"/>
+        </w:rPr>
+        <w:t>pip install -r requirements.txt</w:t>
+      </w:r>
+    </w:p>
+    <w:p>
+      <w:pPr/>
+      <w:r>
+        <w:t>El archivo requirements.txt incluye los siguientes paquetes:</w:t>
+      </w:r>
+    </w:p>
+    <w:p>
+      <w:pPr/>
+      <w:r>
+        <w:t>flask 3.1.3 — Framework web principal.</w:t>
+      </w:r>
+    </w:p>
+    <w:p>
+      <w:pPr/>
+      <w:r>
+        <w:t>requests 2.32.3 — Consultas HTTP a la API de Have I Been Pwned.</w:t>
+      </w:r>
+    </w:p>
+    <w:p>
+      <w:pPr/>
+      <w:r>
+        <w:t>python-dotenv 1.0.1 — Carga de variables de entorno desde archivo .env.</w:t>
+      </w:r>
+    </w:p>
+    <w:p>
+      <w:pPr>
+        <w:pStyle w:val="Ttulo2"/>
+      </w:pPr>
+      <w:r>
+        <w:t>5.5 Ejecutar el proyecto</w:t>
+      </w:r>
+    </w:p>
+    <w:p>
+      <w:pPr/>
+      <w:r>
+        <w:t>Desde la raiz del repositorio, ejecuta:</w:t>
+      </w:r>
+    </w:p>
+    <w:p>
+      <w:pPr>
+        <w:shd w:val="clear" w:color="auto" w:fill="F0F0F0"/>
+      </w:pPr>
+      <w:r>
+        <w:rPr>
+          <w:rFonts w:ascii="Courier New" w:hAnsi="Courier New"/>
+          <w:sz w:val="18"/>
+        </w:rPr>
+        <w:t>python app.py</w:t>
+      </w:r>
+    </w:p>
+    <w:p>
+      <w:pPr/>
+      <w:r>
+        <w:t>Deberias ver en consola una salida similar a la siguiente:</w:t>
+      </w:r>
+    </w:p>
+    <w:p>
+      <w:pPr>
+        <w:shd w:val="clear" w:color="auto" w:fill="F0F0F0"/>
+      </w:pPr>
+      <w:r>
+        <w:rPr>
+          <w:rFonts w:ascii="Courier New" w:hAnsi="Courier New"/>
+          <w:sz w:val="18"/>
+        </w:rPr>
+        <w:t xml:space="preserve"> * Running on http://127.0.0.1:5000</w:t>
+      </w:r>
+    </w:p>
+    <w:p>
+      <w:pPr>
+        <w:shd w:val="clear" w:color="auto" w:fill="F0F0F0"/>
+      </w:pPr>
+      <w:r>
+        <w:rPr>
+          <w:rFonts w:ascii="Courier New" w:hAnsi="Courier New"/>
+          <w:sz w:val="18"/>
+        </w:rPr>
+        <w:t xml:space="preserve"> * Debug mode: on</w:t>
+      </w:r>
+    </w:p>
+    <w:p>
+      <w:pPr/>
+      <w:r>
+        <w:t>Abre tu navegador y navega a http://127.0.0.1:5000 para acceder a la aplicacion.</w:t>
+      </w:r>
+    </w:p>
+    <w:p>
+      <w:pPr>
+        <w:pStyle w:val="Ttulo2"/>
+      </w:pPr>
+      <w:r>
+        <w:t>5.6 Iniciar sesion</w:t>
+      </w:r>
+    </w:p>
+    <w:p>
+      <w:pPr/>
+      <w:r>
+        <w:t>CiberEscudo utiliza un usuario fijo para el entorno de desarrollo (MVP local). No es necesario registrarse. Las credenciales de acceso son:</w:t>
+      </w:r>
+    </w:p>
+    <w:p>
+      <w:pPr/>
+      <w:r>
+        <w:t>Usuario: admin</w:t>
+      </w:r>
+    </w:p>
+    <w:p>
+      <w:pPr/>
+      <w:r>
+        <w:t>Contrasena: ciberescudo123</w:t>
+      </w:r>
+    </w:p>
+    <w:p>
+      <w:pPr/>
+      <w:r>
+        <w:t>Ingresa las credenciales en la pantalla de login y haz clic en Iniciar Sesion. El sistema validara las credenciales y redirigira automaticamente al panel principal de CiberEscudo.</w:t>
+      </w:r>
+    </w:p>
+    <w:p>
+      <w:pPr>
+        <w:pStyle w:val="Ttulo2"/>
+      </w:pPr>
+      <w:r>
+        <w:t>5.7 Estructura del proyecto</w:t>
+      </w:r>
+    </w:p>
+    <w:p>
+      <w:pPr/>
+      <w:r>
+        <w:t>Organizacion de carpetas y archivos principales del proyecto:</w:t>
+      </w:r>
+    </w:p>
+    <w:p>
+      <w:pPr>
+        <w:shd w:val="clear" w:color="auto" w:fill="F0F0F0"/>
+      </w:pPr>
+      <w:r>
+        <w:rPr>
+          <w:rFonts w:ascii="Courier New" w:hAnsi="Courier New"/>
+          <w:sz w:val="18"/>
+        </w:rPr>
+        <w:t>app.py                  - Punto de entrada principal de Flask.</w:t>
+      </w:r>
+    </w:p>
+    <w:p>
+      <w:pPr>
+        <w:shd w:val="clear" w:color="auto" w:fill="F0F0F0"/>
+      </w:pPr>
+      <w:r>
+        <w:rPr>
+          <w:rFonts w:ascii="Courier New" w:hAnsi="Courier New"/>
+          <w:sz w:val="18"/>
+        </w:rPr>
+        <w:t>config.py               - Configuracion global y registro de servicios (SOA).</w:t>
+      </w:r>
+    </w:p>
+    <w:p>
+      <w:pPr>
+        <w:shd w:val="clear" w:color="auto" w:fill="F0F0F0"/>
+      </w:pPr>
+      <w:r>
+        <w:rPr>
+          <w:rFonts w:ascii="Courier New" w:hAnsi="Courier New"/>
+          <w:sz w:val="18"/>
+        </w:rPr>
+        <w:t>requirements.txt        - Lista de dependencias Python.</w:t>
+      </w:r>
+    </w:p>
+    <w:p>
+      <w:pPr>
+        <w:shd w:val="clear" w:color="auto" w:fill="F0F0F0"/>
+      </w:pPr>
+      <w:r>
+        <w:rPr>
+          <w:rFonts w:ascii="Courier New" w:hAnsi="Courier New"/>
+          <w:sz w:val="18"/>
+        </w:rPr>
+        <w:t>routes/                 - Blueprints de cada servicio SOA.</w:t>
+      </w:r>
+    </w:p>
+    <w:p>
+      <w:pPr>
+        <w:shd w:val="clear" w:color="auto" w:fill="F0F0F0"/>
+      </w:pPr>
+      <w:r>
+        <w:rPr>
+          <w:rFonts w:ascii="Courier New" w:hAnsi="Courier New"/>
+          <w:sz w:val="18"/>
+        </w:rPr>
+        <w:t xml:space="preserve">    auth.py             - Servicio de autenticacion.</w:t>
+      </w:r>
+    </w:p>
+    <w:p>
+      <w:pPr>
+        <w:shd w:val="clear" w:color="auto" w:fill="F0F0F0"/>
+      </w:pPr>
+      <w:r>
+        <w:rPr>
+          <w:rFonts w:ascii="Courier New" w:hAnsi="Courier New"/>
+          <w:sz w:val="18"/>
+        </w:rPr>
+        <w:t xml:space="preserve">    monitoring.py       - Servicio de monitoreo de correos.</w:t>
+      </w:r>
+    </w:p>
+    <w:p>
+      <w:pPr>
+        <w:shd w:val="clear" w:color="auto" w:fill="F0F0F0"/>
+      </w:pPr>
+      <w:r>
+        <w:rPr>
+          <w:rFonts w:ascii="Courier New" w:hAnsi="Courier New"/>
+          <w:sz w:val="18"/>
+        </w:rPr>
+        <w:t xml:space="preserve">    passwords.py        - Servicio de verificacion de contrasenas.</w:t>
+      </w:r>
+    </w:p>
+    <w:p>
+      <w:pPr>
+        <w:shd w:val="clear" w:color="auto" w:fill="F0F0F0"/>
+      </w:pPr>
+      <w:r>
+        <w:rPr>
+          <w:rFonts w:ascii="Courier New" w:hAnsi="Courier New"/>
+          <w:sz w:val="18"/>
+        </w:rPr>
+        <w:t xml:space="preserve">    guides.py           - Servicio de guias de accion.</w:t>
+      </w:r>
+    </w:p>
+    <w:p>
+      <w:pPr>
+        <w:shd w:val="clear" w:color="auto" w:fill="F0F0F0"/>
+      </w:pPr>
+      <w:r>
+        <w:rPr>
+          <w:rFonts w:ascii="Courier New" w:hAnsi="Courier New"/>
+          <w:sz w:val="18"/>
+        </w:rPr>
+        <w:t xml:space="preserve">    history.py          - Servicio de historial de alertas.</w:t>
+      </w:r>
+    </w:p>
+    <w:p>
+      <w:pPr>
+        <w:shd w:val="clear" w:color="auto" w:fill="F0F0F0"/>
+      </w:pPr>
+      <w:r>
+        <w:rPr>
+          <w:rFonts w:ascii="Courier New" w:hAnsi="Courier New"/>
+          <w:sz w:val="18"/>
+        </w:rPr>
+        <w:t>services/               - Logica de negocio de cada servicio.</w:t>
+      </w:r>
+    </w:p>
+    <w:p>
+      <w:pPr>
+        <w:shd w:val="clear" w:color="auto" w:fill="F0F0F0"/>
+      </w:pPr>
+      <w:r>
+        <w:rPr>
+          <w:rFonts w:ascii="Courier New" w:hAnsi="Courier New"/>
+          <w:sz w:val="18"/>
+        </w:rPr>
+        <w:t xml:space="preserve">    hibp_service.py     - Adaptador HIBP (brechas de correo).</w:t>
+      </w:r>
+    </w:p>
+    <w:p>
+      <w:pPr>
+        <w:shd w:val="clear" w:color="auto" w:fill="F0F0F0"/>
+      </w:pPr>
+      <w:r>
+        <w:rPr>
+          <w:rFonts w:ascii="Courier New" w:hAnsi="Courier New"/>
+          <w:sz w:val="18"/>
+        </w:rPr>
+        <w:t xml:space="preserve">    password_checker.py - Verificacion con k-Anonymity.</w:t>
+      </w:r>
+    </w:p>
+    <w:p>
+      <w:pPr>
+        <w:shd w:val="clear" w:color="auto" w:fill="F0F0F0"/>
+      </w:pPr>
+      <w:r>
+        <w:rPr>
+          <w:rFonts w:ascii="Courier New" w:hAnsi="Courier New"/>
+          <w:sz w:val="18"/>
+        </w:rPr>
+        <w:t xml:space="preserve">    action_guides.py    - Guias en espanol con referencias colombianas.</w:t>
+      </w:r>
+    </w:p>
+    <w:p>
+      <w:pPr>
+        <w:shd w:val="clear" w:color="auto" w:fill="F0F0F0"/>
+      </w:pPr>
+      <w:r>
+        <w:rPr>
+          <w:rFonts w:ascii="Courier New" w:hAnsi="Courier New"/>
+          <w:sz w:val="18"/>
+        </w:rPr>
+        <w:t xml:space="preserve">    history_service.py  - Persistencia SQLite.</w:t>
+      </w:r>
+    </w:p>
+    <w:p>
+      <w:pPr>
+        <w:shd w:val="clear" w:color="auto" w:fill="F0F0F0"/>
+      </w:pPr>
+      <w:r>
+        <w:rPr>
+          <w:rFonts w:ascii="Courier New" w:hAnsi="Courier New"/>
+          <w:sz w:val="18"/>
+        </w:rPr>
+        <w:t>templates/              - Vistas HTML con Jinja2 y Bootstrap 5.</w:t>
+      </w:r>
+    </w:p>
+    <w:p>
+      <w:pPr>
+        <w:shd w:val="clear" w:color="auto" w:fill="F0F0F0"/>
+      </w:pPr>
+      <w:r>
+        <w:rPr>
+          <w:rFonts w:ascii="Courier New" w:hAnsi="Courier New"/>
+          <w:sz w:val="18"/>
+        </w:rPr>
+        <w:t>static/css/             - Estilos personalizados del tema oscuro.</w:t>
+      </w:r>
+    </w:p>
+    <w:p>
+      <w:pPr>
+        <w:pStyle w:val="Ttulo2"/>
+      </w:pPr>
+      <w:r>
+        <w:t>5.8 Endpoints disponibles</w:t>
+      </w:r>
+    </w:p>
+    <w:p>
+      <w:pPr/>
+      <w:r>
+        <w:t>Rutas HTTP expuestas por la aplicacion:</w:t>
+      </w:r>
+    </w:p>
+    <w:p>
+      <w:pPr/>
+      <w:r>
+        <w:t>GET  /                      Panel principal (requiere sesion activa).</w:t>
+      </w:r>
+    </w:p>
+    <w:p>
+      <w:pPr/>
+      <w:r>
+        <w:t>GET/POST  /auth/login       Formulario de inicio de sesion.</w:t>
+      </w:r>
+    </w:p>
+    <w:p>
+      <w:pPr/>
+      <w:r>
+        <w:t>GET  /auth/logout           Cierre de sesion.</w:t>
+      </w:r>
+    </w:p>
+    <w:p>
+      <w:pPr/>
+      <w:r>
+        <w:t>POST /monitoring/check      Verificar si un correo fue filtrado.</w:t>
+      </w:r>
+    </w:p>
+    <w:p>
+      <w:pPr/>
+      <w:r>
+        <w:t>GET/POST  /passwords/check  Verificar si una contrasena fue comprometida.</w:t>
+      </w:r>
+    </w:p>
+    <w:p>
+      <w:pPr/>
+      <w:r>
+        <w:t>GET  /history/              Historial de alertas registradas.</w:t>
+      </w:r>
+    </w:p>
+    <w:p>
+      <w:pPr/>
+      <w:r>
+        <w:t>GET  /guides/&lt;tipo&gt;         Guia de accion para un tipo de dato expuesto.</w:t>
+      </w:r>
+    </w:p>
+    <w:p>
+      <w:pPr/>
+      <w:r>
+        <w:t>GET  /api/v1/health         Estado global del sistema.</w:t>
       </w:r>
     </w:p>
     <w:p>

</xml_diff>